<commit_message>
Small format change to title page
</commit_message>
<xml_diff>
--- a/Museum Walkthrough Booklet.docx
+++ b/Museum Walkthrough Booklet.docx
@@ -178,19 +178,39 @@
           <w:szCs w:val="40"/>
         </w:rPr>
       </w:pPr>
-      <w:r>
+    </w:p>
+    <w:p>
+      <w:pPr>
+        <w:jc w:val="center"/>
         <w:rPr>
           <w:rFonts w:ascii="Merriweather" w:hAnsi="Merriweather"/>
           <w:sz w:val="40"/>
           <w:szCs w:val="40"/>
         </w:rPr>
+      </w:pPr>
+    </w:p>
+    <w:p>
+      <w:pPr>
+        <w:jc w:val="center"/>
+        <w:rPr>
+          <w:rFonts w:ascii="Merriweather" w:hAnsi="Merriweather"/>
+          <w:sz w:val="48"/>
+          <w:szCs w:val="48"/>
+        </w:rPr>
+      </w:pPr>
+      <w:r>
+        <w:rPr>
+          <w:rFonts w:ascii="Merriweather" w:hAnsi="Merriweather"/>
+          <w:sz w:val="48"/>
+          <w:szCs w:val="48"/>
+        </w:rPr>
         <w:t>Colfax Heritage Museum</w:t>
       </w:r>
       <w:r>
         <w:rPr>
           <w:rFonts w:ascii="Merriweather" w:hAnsi="Merriweather"/>
-          <w:sz w:val="40"/>
-          <w:szCs w:val="40"/>
+          <w:sz w:val="48"/>
+          <w:szCs w:val="48"/>
         </w:rPr>
         <w:br/>
       </w:r>
@@ -200,23 +220,15 @@
         <w:jc w:val="center"/>
         <w:rPr>
           <w:rFonts w:ascii="Merriweather" w:hAnsi="Merriweather"/>
-          <w:sz w:val="40"/>
-          <w:szCs w:val="40"/>
+          <w:sz w:val="48"/>
+          <w:szCs w:val="48"/>
         </w:rPr>
       </w:pPr>
       <w:r>
         <w:rPr>
           <w:rFonts w:ascii="Merriweather" w:hAnsi="Merriweather"/>
-          <w:sz w:val="40"/>
-          <w:szCs w:val="40"/>
-        </w:rPr>
-        <w:t xml:space="preserve">Museum </w:t>
-      </w:r>
-      <w:r>
-        <w:rPr>
-          <w:rFonts w:ascii="Merriweather" w:hAnsi="Merriweather"/>
-          <w:sz w:val="40"/>
-          <w:szCs w:val="40"/>
+          <w:sz w:val="48"/>
+          <w:szCs w:val="48"/>
         </w:rPr>
         <w:t>Walkthrough</w:t>
       </w:r>
@@ -518,43 +530,7 @@
           <w:sz w:val="18"/>
           <w:szCs w:val="18"/>
         </w:rPr>
-        <w:t xml:space="preserve">All GS-class 4400 engines were authorized to operate up to 75mph. On </w:t>
-      </w:r>
-      <w:proofErr w:type="gramStart"/>
-      <w:r>
-        <w:rPr>
-          <w:rFonts w:eastAsia="Times New Roman"/>
-          <w:sz w:val="18"/>
-          <w:szCs w:val="18"/>
-        </w:rPr>
-        <w:t>1958</w:t>
-      </w:r>
-      <w:proofErr w:type="gramEnd"/>
-      <w:r>
-        <w:rPr>
-          <w:rFonts w:eastAsia="Times New Roman"/>
-          <w:sz w:val="18"/>
-          <w:szCs w:val="18"/>
-        </w:rPr>
-        <w:t xml:space="preserve"> last run, 4460 was stopwatch-timed reaching 77mph between McClellan Field and Swanston, north of Sacramento. A fireman on the run, Hal </w:t>
-      </w:r>
-      <w:proofErr w:type="spellStart"/>
-      <w:r>
-        <w:rPr>
-          <w:rFonts w:eastAsia="Times New Roman"/>
-          <w:sz w:val="18"/>
-          <w:szCs w:val="18"/>
-        </w:rPr>
-        <w:t>Wilmunder</w:t>
-      </w:r>
-      <w:proofErr w:type="spellEnd"/>
-      <w:r>
-        <w:rPr>
-          <w:rFonts w:eastAsia="Times New Roman"/>
-          <w:sz w:val="18"/>
-          <w:szCs w:val="18"/>
-        </w:rPr>
-        <w:t xml:space="preserve">, claimed speeds </w:t>
+        <w:t xml:space="preserve">All GS-class 4400 engines were authorized to operate up to 75mph. On 1958 last run, 4460 was stopwatch-timed reaching 77mph between McClellan Field and Swanston, north of Sacramento. A fireman on the run, Hal Wilmunder, claimed speeds </w:t>
       </w:r>
       <w:proofErr w:type="gramStart"/>
       <w:r>
@@ -1090,25 +1066,7 @@
           <w:sz w:val="18"/>
           <w:szCs w:val="18"/>
         </w:rPr>
-        <w:t xml:space="preserve">SP 2685 Harriman Associated Railroads Common Standard Baldwin C-4 CONSOLIDATION 2-8-0 Engine wt. 198,420 Drivers wt. 178,000 Boiler Pressure 200psi 43,000 </w:t>
-      </w:r>
-      <w:proofErr w:type="gramStart"/>
-      <w:r>
-        <w:rPr>
-          <w:rFonts w:eastAsia="Times New Roman"/>
-          <w:sz w:val="18"/>
-          <w:szCs w:val="18"/>
-        </w:rPr>
-        <w:t>drawbar</w:t>
-      </w:r>
-      <w:proofErr w:type="gramEnd"/>
-      <w:r>
-        <w:rPr>
-          <w:rFonts w:eastAsia="Times New Roman"/>
-          <w:sz w:val="18"/>
-          <w:szCs w:val="18"/>
-        </w:rPr>
-        <w:t xml:space="preserve"> pull. Top speed 45mph </w:t>
+        <w:t xml:space="preserve">SP 2685 Harriman Associated Railroads Common Standard Baldwin C-4 CONSOLIDATION 2-8-0 Engine wt. 198,420 Drivers wt. 178,000 Boiler Pressure 200psi 43,000 drawbar pull. Top speed 45mph </w:t>
       </w:r>
     </w:p>
     <w:p>
@@ -1942,25 +1900,7 @@
           <w:sz w:val="18"/>
           <w:szCs w:val="18"/>
         </w:rPr>
-        <w:t xml:space="preserve"> Colfax sometimes ran east to Ogden. These engines ran Sunset Limited,' Golden State Limited, passing Colfax on the "Overland. F World's Fair 1939-1941 saw SP 4300'</w:t>
-      </w:r>
-      <w:proofErr w:type="gramStart"/>
-      <w:r>
-        <w:rPr>
-          <w:rFonts w:eastAsia="Times New Roman"/>
-          <w:sz w:val="18"/>
-          <w:szCs w:val="18"/>
-        </w:rPr>
-        <w:t>s on</w:t>
-      </w:r>
-      <w:proofErr w:type="gramEnd"/>
-      <w:r>
-        <w:rPr>
-          <w:rFonts w:eastAsia="Times New Roman"/>
-          <w:sz w:val="18"/>
-          <w:szCs w:val="18"/>
-        </w:rPr>
-        <w:t xml:space="preserve"> crack "</w:t>
+        <w:t xml:space="preserve"> Colfax sometimes ran east to Ogden. These engines ran Sunset Limited,' Golden State Limited, passing Colfax on the "Overland. F World's Fair 1939-1941 saw SP 4300's on crack "</w:t>
       </w:r>
       <w:proofErr w:type="spellStart"/>
       <w:r>
@@ -1978,25 +1918,7 @@
           <w:sz w:val="18"/>
           <w:szCs w:val="18"/>
         </w:rPr>
-        <w:t xml:space="preserve">" </w:t>
-      </w:r>
-      <w:proofErr w:type="gramStart"/>
-      <w:r>
-        <w:rPr>
-          <w:rFonts w:eastAsia="Times New Roman"/>
-          <w:sz w:val="18"/>
-          <w:szCs w:val="18"/>
-        </w:rPr>
-        <w:t>thru</w:t>
-      </w:r>
-      <w:proofErr w:type="gramEnd"/>
-      <w:r>
-        <w:rPr>
-          <w:rFonts w:eastAsia="Times New Roman"/>
-          <w:sz w:val="18"/>
-          <w:szCs w:val="18"/>
-        </w:rPr>
-        <w:t xml:space="preserve"> </w:t>
+        <w:t xml:space="preserve">" thru </w:t>
       </w:r>
       <w:proofErr w:type="spellStart"/>
       <w:proofErr w:type="gramStart"/>
@@ -2307,25 +2229,7 @@
           <w:sz w:val="18"/>
           <w:szCs w:val="18"/>
         </w:rPr>
-        <w:t xml:space="preserve">SP 4449 is </w:t>
-      </w:r>
-      <w:proofErr w:type="gramStart"/>
-      <w:r>
-        <w:rPr>
-          <w:rFonts w:eastAsia="Times New Roman"/>
-          <w:sz w:val="18"/>
-          <w:szCs w:val="18"/>
-        </w:rPr>
-        <w:t>most</w:t>
-      </w:r>
-      <w:proofErr w:type="gramEnd"/>
-      <w:r>
-        <w:rPr>
-          <w:rFonts w:eastAsia="Times New Roman"/>
-          <w:sz w:val="18"/>
-          <w:szCs w:val="18"/>
-        </w:rPr>
-        <w:t xml:space="preserve"> photographed locomotive in history, now in DAYLIGHT regalia, holding forth from spacious shop/display building in Portland Oregon. 27 other GS-4 4400's in somber black gave their last chug on Sacramento Division Freight and Coast Division commuters runs, occasionally helping trains through Colfax; with big silver faces shiny to the end. After roaming over the </w:t>
+        <w:t xml:space="preserve">SP 4449 is most photographed locomotive in history, now in DAYLIGHT regalia, holding forth from spacious shop/display building in Portland Oregon. 27 other GS-4 4400's in somber black gave their last chug on Sacramento Division Freight and Coast Division commuters runs, occasionally helping trains through Colfax; with big silver faces shiny to the end. After roaming over the </w:t>
       </w:r>
       <w:proofErr w:type="gramStart"/>
       <w:r>
@@ -2680,6 +2584,7 @@
       <w:r>
         <w:rPr>
           <w:rStyle w:val="Strong"/>
+          <w:noProof/>
         </w:rPr>
         <w:lastRenderedPageBreak/>
         <w:drawing>
@@ -2741,6 +2646,7 @@
       <w:r>
         <w:rPr>
           <w:rStyle w:val="Strong"/>
+          <w:noProof/>
         </w:rPr>
         <w:lastRenderedPageBreak/>
         <w:drawing>

</xml_diff>

<commit_message>
Added museum display section and format
</commit_message>
<xml_diff>
--- a/Museum Walkthrough Booklet.docx
+++ b/Museum Walkthrough Booklet.docx
@@ -26,7 +26,7 @@
                     <pic:cNvPicPr/>
                   </pic:nvPicPr>
                   <pic:blipFill>
-                    <a:blip r:embed="rId4" cstate="print">
+                    <a:blip r:embed="rId5" cstate="print">
                       <a:extLst>
                         <a:ext uri="{28A0092B-C50C-407E-A947-70E740481C1C}">
                           <a14:useLocalDpi xmlns:a14="http://schemas.microsoft.com/office/drawing/2010/main" val="0"/>
@@ -708,7 +708,7 @@
                     <pic:cNvPicPr/>
                   </pic:nvPicPr>
                   <pic:blipFill>
-                    <a:blip r:embed="rId5" cstate="print">
+                    <a:blip r:embed="rId6" cstate="print">
                       <a:extLst>
                         <a:ext uri="{28A0092B-C50C-407E-A947-70E740481C1C}">
                           <a14:useLocalDpi xmlns:a14="http://schemas.microsoft.com/office/drawing/2010/main" val="0"/>
@@ -922,7 +922,7 @@
                     <pic:cNvPicPr/>
                   </pic:nvPicPr>
                   <pic:blipFill>
-                    <a:blip r:embed="rId5" cstate="print">
+                    <a:blip r:embed="rId6" cstate="print">
                       <a:extLst>
                         <a:ext uri="{28A0092B-C50C-407E-A947-70E740481C1C}">
                           <a14:useLocalDpi xmlns:a14="http://schemas.microsoft.com/office/drawing/2010/main" val="0"/>
@@ -1281,7 +1281,7 @@
                     <pic:cNvPicPr/>
                   </pic:nvPicPr>
                   <pic:blipFill>
-                    <a:blip r:embed="rId5" cstate="print">
+                    <a:blip r:embed="rId6" cstate="print">
                       <a:extLst>
                         <a:ext uri="{28A0092B-C50C-407E-A947-70E740481C1C}">
                           <a14:useLocalDpi xmlns:a14="http://schemas.microsoft.com/office/drawing/2010/main" val="0"/>
@@ -2015,7 +2015,7 @@
                     <pic:cNvPicPr/>
                   </pic:nvPicPr>
                   <pic:blipFill>
-                    <a:blip r:embed="rId5" cstate="print">
+                    <a:blip r:embed="rId6" cstate="print">
                       <a:extLst>
                         <a:ext uri="{28A0092B-C50C-407E-A947-70E740481C1C}">
                           <a14:useLocalDpi xmlns:a14="http://schemas.microsoft.com/office/drawing/2010/main" val="0"/>
@@ -2395,7 +2395,7 @@
                     <pic:cNvPicPr/>
                   </pic:nvPicPr>
                   <pic:blipFill>
-                    <a:blip r:embed="rId5" cstate="print">
+                    <a:blip r:embed="rId6" cstate="print">
                       <a:extLst>
                         <a:ext uri="{28A0092B-C50C-407E-A947-70E740481C1C}">
                           <a14:useLocalDpi xmlns:a14="http://schemas.microsoft.com/office/drawing/2010/main" val="0"/>
@@ -2464,6 +2464,402 @@
     </w:p>
     <w:p>
       <w:pPr>
+        <w:pStyle w:val="Heading2"/>
+        <w:rPr>
+          <w:rFonts w:eastAsia="Times New Roman"/>
+        </w:rPr>
+      </w:pPr>
+      <w:r>
+        <w:rPr>
+          <w:rFonts w:eastAsia="Times New Roman"/>
+        </w:rPr>
+        <w:lastRenderedPageBreak/>
+        <w:t>The Museum Displays</w:t>
+      </w:r>
+    </w:p>
+    <w:p/>
+    <w:p>
+      <w:r>
+        <w:t>Case 1</w:t>
+      </w:r>
+    </w:p>
+    <w:p>
+      <w:pPr>
+        <w:pStyle w:val="ListParagraph"/>
+        <w:numPr>
+          <w:ilvl w:val="0"/>
+          <w:numId w:val="1"/>
+        </w:numPr>
+      </w:pPr>
+      <w:r>
+        <w:rPr>
+          <w:u w:val="single"/>
+        </w:rPr>
+        <w:t>Accession Number</w:t>
+      </w:r>
+      <w:r>
+        <w:t xml:space="preserve"> – Short Descriptio</w:t>
+      </w:r>
+      <w:r>
+        <w:t>n</w:t>
+      </w:r>
+      <w:r>
+        <w:br/>
+      </w:r>
+      <w:r>
+        <w:br/>
+      </w:r>
+      <w:r>
+        <w:t xml:space="preserve">"Lorem ipsum dolor sit </w:t>
+      </w:r>
+      <w:proofErr w:type="spellStart"/>
+      <w:r>
+        <w:t>amet</w:t>
+      </w:r>
+      <w:proofErr w:type="spellEnd"/>
+      <w:r>
+        <w:t xml:space="preserve">, </w:t>
+      </w:r>
+      <w:proofErr w:type="spellStart"/>
+      <w:r>
+        <w:t>consectetur</w:t>
+      </w:r>
+      <w:proofErr w:type="spellEnd"/>
+      <w:r>
+        <w:t xml:space="preserve"> </w:t>
+      </w:r>
+      <w:proofErr w:type="spellStart"/>
+      <w:r>
+        <w:t>adipiscing</w:t>
+      </w:r>
+      <w:proofErr w:type="spellEnd"/>
+      <w:r>
+        <w:t xml:space="preserve"> </w:t>
+      </w:r>
+      <w:proofErr w:type="spellStart"/>
+      <w:r>
+        <w:t>elit</w:t>
+      </w:r>
+      <w:proofErr w:type="spellEnd"/>
+      <w:r>
+        <w:t xml:space="preserve">, sed do </w:t>
+      </w:r>
+      <w:proofErr w:type="spellStart"/>
+      <w:r>
+        <w:t>eiusmod</w:t>
+      </w:r>
+      <w:proofErr w:type="spellEnd"/>
+      <w:r>
+        <w:t xml:space="preserve"> </w:t>
+      </w:r>
+      <w:proofErr w:type="spellStart"/>
+      <w:r>
+        <w:t>tempor</w:t>
+      </w:r>
+      <w:proofErr w:type="spellEnd"/>
+      <w:r>
+        <w:t xml:space="preserve"> </w:t>
+      </w:r>
+      <w:proofErr w:type="spellStart"/>
+      <w:r>
+        <w:t>incididunt</w:t>
+      </w:r>
+      <w:proofErr w:type="spellEnd"/>
+      <w:r>
+        <w:t xml:space="preserve"> </w:t>
+      </w:r>
+      <w:proofErr w:type="spellStart"/>
+      <w:r>
+        <w:t>ut</w:t>
+      </w:r>
+      <w:proofErr w:type="spellEnd"/>
+      <w:r>
+        <w:t xml:space="preserve"> labore et dolore magna </w:t>
+      </w:r>
+      <w:proofErr w:type="spellStart"/>
+      <w:r>
+        <w:t>aliqua</w:t>
+      </w:r>
+      <w:proofErr w:type="spellEnd"/>
+      <w:r>
+        <w:t xml:space="preserve">. Ut </w:t>
+      </w:r>
+      <w:proofErr w:type="spellStart"/>
+      <w:r>
+        <w:t>enim</w:t>
+      </w:r>
+      <w:proofErr w:type="spellEnd"/>
+      <w:r>
+        <w:t xml:space="preserve"> ad minim </w:t>
+      </w:r>
+      <w:proofErr w:type="spellStart"/>
+      <w:r>
+        <w:t>veniam</w:t>
+      </w:r>
+      <w:proofErr w:type="spellEnd"/>
+      <w:r>
+        <w:t xml:space="preserve">, quis </w:t>
+      </w:r>
+      <w:proofErr w:type="spellStart"/>
+      <w:r>
+        <w:t>nostrud</w:t>
+      </w:r>
+      <w:proofErr w:type="spellEnd"/>
+      <w:r>
+        <w:t xml:space="preserve"> exercitation </w:t>
+      </w:r>
+      <w:proofErr w:type="spellStart"/>
+      <w:r>
+        <w:t>ullamco</w:t>
+      </w:r>
+      <w:proofErr w:type="spellEnd"/>
+      <w:r>
+        <w:t xml:space="preserve"> </w:t>
+      </w:r>
+      <w:proofErr w:type="spellStart"/>
+      <w:r>
+        <w:t>laboris</w:t>
+      </w:r>
+      <w:proofErr w:type="spellEnd"/>
+      <w:r>
+        <w:t xml:space="preserve"> nisi </w:t>
+      </w:r>
+      <w:proofErr w:type="spellStart"/>
+      <w:r>
+        <w:t>ut</w:t>
+      </w:r>
+      <w:proofErr w:type="spellEnd"/>
+      <w:r>
+        <w:t xml:space="preserve"> </w:t>
+      </w:r>
+      <w:proofErr w:type="spellStart"/>
+      <w:r>
+        <w:t>aliquip</w:t>
+      </w:r>
+      <w:proofErr w:type="spellEnd"/>
+      <w:r>
+        <w:t xml:space="preserve"> ex </w:t>
+      </w:r>
+      <w:proofErr w:type="spellStart"/>
+      <w:r>
+        <w:t>ea</w:t>
+      </w:r>
+      <w:proofErr w:type="spellEnd"/>
+      <w:r>
+        <w:t xml:space="preserve"> </w:t>
+      </w:r>
+      <w:proofErr w:type="spellStart"/>
+      <w:r>
+        <w:t>commodo</w:t>
+      </w:r>
+      <w:proofErr w:type="spellEnd"/>
+      <w:r>
+        <w:t xml:space="preserve"> </w:t>
+      </w:r>
+      <w:proofErr w:type="spellStart"/>
+      <w:r>
+        <w:t>consequat</w:t>
+      </w:r>
+      <w:proofErr w:type="spellEnd"/>
+      <w:r>
+        <w:t xml:space="preserve">. Duis </w:t>
+      </w:r>
+      <w:proofErr w:type="spellStart"/>
+      <w:r>
+        <w:t>aute</w:t>
+      </w:r>
+      <w:proofErr w:type="spellEnd"/>
+      <w:r>
+        <w:t xml:space="preserve"> </w:t>
+      </w:r>
+      <w:proofErr w:type="spellStart"/>
+      <w:r>
+        <w:t>irure</w:t>
+      </w:r>
+      <w:proofErr w:type="spellEnd"/>
+      <w:r>
+        <w:t xml:space="preserve"> dolor in </w:t>
+      </w:r>
+      <w:proofErr w:type="spellStart"/>
+      <w:r>
+        <w:t>reprehenderit</w:t>
+      </w:r>
+      <w:proofErr w:type="spellEnd"/>
+      <w:r>
+        <w:t xml:space="preserve"> in </w:t>
+      </w:r>
+      <w:proofErr w:type="spellStart"/>
+      <w:r>
+        <w:t>voluptate</w:t>
+      </w:r>
+      <w:proofErr w:type="spellEnd"/>
+      <w:r>
+        <w:t xml:space="preserve"> </w:t>
+      </w:r>
+      <w:proofErr w:type="spellStart"/>
+      <w:r>
+        <w:t>velit</w:t>
+      </w:r>
+      <w:proofErr w:type="spellEnd"/>
+      <w:r>
+        <w:t xml:space="preserve"> esse </w:t>
+      </w:r>
+      <w:proofErr w:type="spellStart"/>
+      <w:r>
+        <w:t>cillum</w:t>
+      </w:r>
+      <w:proofErr w:type="spellEnd"/>
+      <w:r>
+        <w:t xml:space="preserve"> dolore </w:t>
+      </w:r>
+      <w:proofErr w:type="spellStart"/>
+      <w:r>
+        <w:t>eu</w:t>
+      </w:r>
+      <w:proofErr w:type="spellEnd"/>
+      <w:r>
+        <w:t xml:space="preserve"> </w:t>
+      </w:r>
+      <w:proofErr w:type="spellStart"/>
+      <w:r>
+        <w:t>fugiat</w:t>
+      </w:r>
+      <w:proofErr w:type="spellEnd"/>
+      <w:r>
+        <w:t xml:space="preserve"> </w:t>
+      </w:r>
+      <w:proofErr w:type="spellStart"/>
+      <w:r>
+        <w:t>nulla</w:t>
+      </w:r>
+      <w:proofErr w:type="spellEnd"/>
+      <w:r>
+        <w:t xml:space="preserve"> </w:t>
+      </w:r>
+      <w:proofErr w:type="spellStart"/>
+      <w:r>
+        <w:t>pariatur</w:t>
+      </w:r>
+      <w:proofErr w:type="spellEnd"/>
+      <w:r>
+        <w:t>.</w:t>
+      </w:r>
+      <w:r>
+        <w:t>”</w:t>
+      </w:r>
+    </w:p>
+    <w:p>
+      <w:r>
+        <w:rPr>
+          <w:noProof/>
+        </w:rPr>
+        <w:drawing>
+          <wp:anchor distT="0" distB="0" distL="114300" distR="114300" simplePos="0" relativeHeight="251661315" behindDoc="0" locked="0" layoutInCell="1" allowOverlap="1" wp14:anchorId="45906938" wp14:editId="1ED0CBCC">
+            <wp:simplePos x="0" y="0"/>
+            <wp:positionH relativeFrom="column">
+              <wp:posOffset>3460422</wp:posOffset>
+            </wp:positionH>
+            <wp:positionV relativeFrom="paragraph">
+              <wp:posOffset>11819</wp:posOffset>
+            </wp:positionV>
+            <wp:extent cx="414655" cy="408305"/>
+            <wp:effectExtent l="0" t="0" r="4445" b="0"/>
+            <wp:wrapNone/>
+            <wp:docPr id="104622713" name="Picture 1"/>
+            <wp:cNvGraphicFramePr>
+              <a:graphicFrameLocks xmlns:a="http://schemas.openxmlformats.org/drawingml/2006/main" noChangeAspect="1"/>
+            </wp:cNvGraphicFramePr>
+            <a:graphic xmlns:a="http://schemas.openxmlformats.org/drawingml/2006/main">
+              <a:graphicData uri="http://schemas.openxmlformats.org/drawingml/2006/picture">
+                <pic:pic xmlns:pic="http://schemas.openxmlformats.org/drawingml/2006/picture">
+                  <pic:nvPicPr>
+                    <pic:cNvPr id="0" name="Picture 2"/>
+                    <pic:cNvPicPr>
+                      <a:picLocks noChangeAspect="1" noChangeArrowheads="1"/>
+                    </pic:cNvPicPr>
+                  </pic:nvPicPr>
+                  <pic:blipFill>
+                    <a:blip r:embed="rId7">
+                      <a:extLst>
+                        <a:ext uri="{28A0092B-C50C-407E-A947-70E740481C1C}">
+                          <a14:useLocalDpi xmlns:a14="http://schemas.microsoft.com/office/drawing/2010/main" val="0"/>
+                        </a:ext>
+                      </a:extLst>
+                    </a:blip>
+                    <a:srcRect/>
+                    <a:stretch>
+                      <a:fillRect/>
+                    </a:stretch>
+                  </pic:blipFill>
+                  <pic:spPr bwMode="auto">
+                    <a:xfrm>
+                      <a:off x="0" y="0"/>
+                      <a:ext cx="414655" cy="408305"/>
+                    </a:xfrm>
+                    <a:prstGeom prst="rect">
+                      <a:avLst/>
+                    </a:prstGeom>
+                    <a:noFill/>
+                  </pic:spPr>
+                </pic:pic>
+              </a:graphicData>
+            </a:graphic>
+          </wp:anchor>
+        </w:drawing>
+      </w:r>
+    </w:p>
+    <w:p/>
+    <w:p/>
+    <w:p>
+      <w:r>
+        <w:t>Case 2</w:t>
+      </w:r>
+    </w:p>
+    <w:p>
+      <w:r>
+        <w:t>.</w:t>
+      </w:r>
+    </w:p>
+    <w:p>
+      <w:r>
+        <w:t>.</w:t>
+      </w:r>
+    </w:p>
+    <w:p>
+      <w:r>
+        <w:t>.</w:t>
+      </w:r>
+    </w:p>
+    <w:p>
+      <w:r>
+        <w:t>Cas</w:t>
+      </w:r>
+      <w:r>
+        <w:t>e</w:t>
+      </w:r>
+      <w:r>
+        <w:t xml:space="preserve"> n</w:t>
+      </w:r>
+    </w:p>
+    <w:p>
+      <w:pPr>
+        <w:rPr>
+          <w:rFonts w:eastAsia="Times New Roman"/>
+          <w:sz w:val="18"/>
+          <w:szCs w:val="18"/>
+        </w:rPr>
+      </w:pPr>
+      <w:r>
+        <w:rPr>
+          <w:rFonts w:eastAsia="Times New Roman"/>
+          <w:sz w:val="18"/>
+          <w:szCs w:val="18"/>
+        </w:rPr>
+        <w:br w:type="page"/>
+      </w:r>
+    </w:p>
+    <w:p>
+      <w:pPr>
         <w:rPr>
           <w:rFonts w:eastAsia="Times New Roman"/>
           <w:sz w:val="18"/>
@@ -2603,7 +2999,7 @@
                     <pic:cNvPicPr/>
                   </pic:nvPicPr>
                   <pic:blipFill>
-                    <a:blip r:embed="rId6"/>
+                    <a:blip r:embed="rId8"/>
                     <a:stretch>
                       <a:fillRect/>
                     </a:stretch>
@@ -2665,7 +3061,7 @@
                     <pic:cNvPicPr/>
                   </pic:nvPicPr>
                   <pic:blipFill>
-                    <a:blip r:embed="rId6"/>
+                    <a:blip r:embed="rId8"/>
                     <a:stretch>
                       <a:fillRect/>
                     </a:stretch>
@@ -2763,7 +3159,7 @@
                     <pic:cNvPicPr/>
                   </pic:nvPicPr>
                   <pic:blipFill>
-                    <a:blip r:embed="rId7"/>
+                    <a:blip r:embed="rId9"/>
                     <a:stretch>
                       <a:fillRect/>
                     </a:stretch>
@@ -2792,6 +3188,126 @@
     </w:sectPr>
   </w:body>
 </w:document>
+</file>
+
+<file path=word/numbering.xml><?xml version="1.0" encoding="utf-8"?>
+<w:numbering xmlns:wpc="http://schemas.microsoft.com/office/word/2010/wordprocessingCanvas" xmlns:cx="http://schemas.microsoft.com/office/drawing/2014/chartex" xmlns:cx1="http://schemas.microsoft.com/office/drawing/2015/9/8/chartex" xmlns:cx2="http://schemas.microsoft.com/office/drawing/2015/10/21/chartex" xmlns:cx3="http://schemas.microsoft.com/office/drawing/2016/5/9/chartex" xmlns:cx4="http://schemas.microsoft.com/office/drawing/2016/5/10/chartex" xmlns:cx5="http://schemas.microsoft.com/office/drawing/2016/5/11/chartex" xmlns:cx6="http://schemas.microsoft.com/office/drawing/2016/5/12/chartex" xmlns:cx7="http://schemas.microsoft.com/office/drawing/2016/5/13/chartex" xmlns:cx8="http://schemas.microsoft.com/office/drawing/2016/5/14/chartex" xmlns:mc="http://schemas.openxmlformats.org/markup-compatibility/2006" xmlns:aink="http://schemas.microsoft.com/office/drawing/2016/ink" xmlns:am3d="http://schemas.microsoft.com/office/drawing/2017/model3d" xmlns:o="urn:schemas-microsoft-com:office:office" xmlns:oel="http://schemas.microsoft.com/office/2019/extlst" xmlns:r="http://schemas.openxmlformats.org/officeDocument/2006/relationships" xmlns:m="http://schemas.openxmlformats.org/officeDocument/2006/math" xmlns:v="urn:schemas-microsoft-com:vml" xmlns:wp14="http://schemas.microsoft.com/office/word/2010/wordprocessingDrawing" xmlns:wp="http://schemas.openxmlformats.org/drawingml/2006/wordprocessingDrawing" xmlns:w10="urn:schemas-microsoft-com:office:word" xmlns:w="http://schemas.openxmlformats.org/wordprocessingml/2006/main" xmlns:w14="http://schemas.microsoft.com/office/word/2010/wordml" xmlns:w15="http://schemas.microsoft.com/office/word/2012/wordml" xmlns:w16cex="http://schemas.microsoft.com/office/word/2018/wordml/cex" xmlns:w16cid="http://schemas.microsoft.com/office/word/2016/wordml/cid" xmlns:w16="http://schemas.microsoft.com/office/word/2018/wordml" xmlns:w16du="http://schemas.microsoft.com/office/word/2023/wordml/word16du" xmlns:w16sdtdh="http://schemas.microsoft.com/office/word/2020/wordml/sdtdatahash" xmlns:w16sdtfl="http://schemas.microsoft.com/office/word/2024/wordml/sdtformatlock" xmlns:w16se="http://schemas.microsoft.com/office/word/2015/wordml/symex" xmlns:wpg="http://schemas.microsoft.com/office/word/2010/wordprocessingGroup" xmlns:wpi="http://schemas.microsoft.com/office/word/2010/wordprocessingInk" xmlns:wne="http://schemas.microsoft.com/office/word/2006/wordml" xmlns:wps="http://schemas.microsoft.com/office/word/2010/wordprocessingShape" mc:Ignorable="w14 w15 w16se w16cid w16 w16cex w16sdtdh w16sdtfl w16du wp14">
+  <w:abstractNum w:abstractNumId="0" w15:restartNumberingAfterBreak="0">
+    <w:nsid w:val="461B430B"/>
+    <w:multiLevelType w:val="hybridMultilevel"/>
+    <w:tmpl w:val="A4746E00"/>
+    <w:lvl w:ilvl="0" w:tplc="B928AE28">
+      <w:numFmt w:val="bullet"/>
+      <w:lvlText w:val="-"/>
+      <w:lvlJc w:val="left"/>
+      <w:pPr>
+        <w:ind w:left="720" w:hanging="360"/>
+      </w:pPr>
+      <w:rPr>
+        <w:rFonts w:ascii="Aptos" w:eastAsiaTheme="minorHAnsi" w:hAnsi="Aptos" w:cstheme="minorBidi" w:hint="default"/>
+      </w:rPr>
+    </w:lvl>
+    <w:lvl w:ilvl="1" w:tplc="04090003" w:tentative="1">
+      <w:start w:val="1"/>
+      <w:numFmt w:val="bullet"/>
+      <w:lvlText w:val="o"/>
+      <w:lvlJc w:val="left"/>
+      <w:pPr>
+        <w:ind w:left="1440" w:hanging="360"/>
+      </w:pPr>
+      <w:rPr>
+        <w:rFonts w:ascii="Courier New" w:hAnsi="Courier New" w:cs="Courier New" w:hint="default"/>
+      </w:rPr>
+    </w:lvl>
+    <w:lvl w:ilvl="2" w:tplc="04090005" w:tentative="1">
+      <w:start w:val="1"/>
+      <w:numFmt w:val="bullet"/>
+      <w:lvlText w:val=""/>
+      <w:lvlJc w:val="left"/>
+      <w:pPr>
+        <w:ind w:left="2160" w:hanging="360"/>
+      </w:pPr>
+      <w:rPr>
+        <w:rFonts w:ascii="Wingdings" w:hAnsi="Wingdings" w:hint="default"/>
+      </w:rPr>
+    </w:lvl>
+    <w:lvl w:ilvl="3" w:tplc="04090001" w:tentative="1">
+      <w:start w:val="1"/>
+      <w:numFmt w:val="bullet"/>
+      <w:lvlText w:val=""/>
+      <w:lvlJc w:val="left"/>
+      <w:pPr>
+        <w:ind w:left="2880" w:hanging="360"/>
+      </w:pPr>
+      <w:rPr>
+        <w:rFonts w:ascii="Symbol" w:hAnsi="Symbol" w:hint="default"/>
+      </w:rPr>
+    </w:lvl>
+    <w:lvl w:ilvl="4" w:tplc="04090003" w:tentative="1">
+      <w:start w:val="1"/>
+      <w:numFmt w:val="bullet"/>
+      <w:lvlText w:val="o"/>
+      <w:lvlJc w:val="left"/>
+      <w:pPr>
+        <w:ind w:left="3600" w:hanging="360"/>
+      </w:pPr>
+      <w:rPr>
+        <w:rFonts w:ascii="Courier New" w:hAnsi="Courier New" w:cs="Courier New" w:hint="default"/>
+      </w:rPr>
+    </w:lvl>
+    <w:lvl w:ilvl="5" w:tplc="04090005" w:tentative="1">
+      <w:start w:val="1"/>
+      <w:numFmt w:val="bullet"/>
+      <w:lvlText w:val=""/>
+      <w:lvlJc w:val="left"/>
+      <w:pPr>
+        <w:ind w:left="4320" w:hanging="360"/>
+      </w:pPr>
+      <w:rPr>
+        <w:rFonts w:ascii="Wingdings" w:hAnsi="Wingdings" w:hint="default"/>
+      </w:rPr>
+    </w:lvl>
+    <w:lvl w:ilvl="6" w:tplc="04090001" w:tentative="1">
+      <w:start w:val="1"/>
+      <w:numFmt w:val="bullet"/>
+      <w:lvlText w:val=""/>
+      <w:lvlJc w:val="left"/>
+      <w:pPr>
+        <w:ind w:left="5040" w:hanging="360"/>
+      </w:pPr>
+      <w:rPr>
+        <w:rFonts w:ascii="Symbol" w:hAnsi="Symbol" w:hint="default"/>
+      </w:rPr>
+    </w:lvl>
+    <w:lvl w:ilvl="7" w:tplc="04090003" w:tentative="1">
+      <w:start w:val="1"/>
+      <w:numFmt w:val="bullet"/>
+      <w:lvlText w:val="o"/>
+      <w:lvlJc w:val="left"/>
+      <w:pPr>
+        <w:ind w:left="5760" w:hanging="360"/>
+      </w:pPr>
+      <w:rPr>
+        <w:rFonts w:ascii="Courier New" w:hAnsi="Courier New" w:cs="Courier New" w:hint="default"/>
+      </w:rPr>
+    </w:lvl>
+    <w:lvl w:ilvl="8" w:tplc="04090005" w:tentative="1">
+      <w:start w:val="1"/>
+      <w:numFmt w:val="bullet"/>
+      <w:lvlText w:val=""/>
+      <w:lvlJc w:val="left"/>
+      <w:pPr>
+        <w:ind w:left="6480" w:hanging="360"/>
+      </w:pPr>
+      <w:rPr>
+        <w:rFonts w:ascii="Wingdings" w:hAnsi="Wingdings" w:hint="default"/>
+      </w:rPr>
+    </w:lvl>
+  </w:abstractNum>
+  <w:num w:numId="1" w16cid:durableId="836656996">
+    <w:abstractNumId w:val="0"/>
+  </w:num>
+</w:numbering>
 </file>
 
 <file path=word/styles.xml><?xml version="1.0" encoding="utf-8"?>
@@ -3223,7 +3739,6 @@
     <w:next w:val="Normal"/>
     <w:link w:val="Heading2Char"/>
     <w:uiPriority w:val="9"/>
-    <w:semiHidden/>
     <w:unhideWhenUsed/>
     <w:qFormat/>
     <w:rsid w:val="00FD0055"/>
@@ -3440,7 +3955,6 @@
     <w:basedOn w:val="DefaultParagraphFont"/>
     <w:link w:val="Heading2"/>
     <w:uiPriority w:val="9"/>
-    <w:semiHidden/>
     <w:rsid w:val="00FD0055"/>
     <w:rPr>
       <w:rFonts w:asciiTheme="majorHAnsi" w:eastAsiaTheme="majorEastAsia" w:hAnsiTheme="majorHAnsi" w:cstheme="majorBidi"/>

</xml_diff>